<commit_message>
feat: implement new theme structure with header and sub-head templates and remove legacy files
</commit_message>
<xml_diff>
--- a/client_delivery_guide.docx
+++ b/client_delivery_guide.docx
@@ -2595,6 +2595,244 @@
                 <w:color w:val="212121"/>
                 <w:sz w:val="20"/>
               </w:rPr>
+              <w:t>데스크톱 GNB 내비게이션</w:t>
+            </w:r>
+          </w:p>
+        </w:tc>
+        <w:tc>
+          <w:tcPr>
+            <w:tcW w:type="dxa" w:w="2340"/>
+            <w:tcMar>
+              <w:top w:w="120" w:type="dxa"/>
+              <w:bottom w:w="120" w:type="dxa"/>
+              <w:left w:w="180" w:type="dxa"/>
+              <w:right w:w="180" w:type="dxa"/>
+            </w:tcMar>
+            <w:shd w:fill="F9FBF9"/>
+            <w:tcBorders>
+              <w:top w:sz="2" w:val="single" w:color="CCCCCC"/>
+              <w:bottom w:sz="2" w:val="single" w:color="CCCCCC"/>
+              <w:left w:sz="2" w:val="single" w:color="CCCCCC"/>
+              <w:right w:sz="2" w:val="single" w:color="CCCCCC"/>
+            </w:tcBorders>
+          </w:tcPr>
+          <w:p>
+            <w:pPr>
+              <w:spacing w:after="40" w:line="276" w:lineRule="auto"/>
+            </w:pPr>
+            <w:r>
+              <w:rPr>
+                <w:rFonts w:ascii="Malgun Gothic" w:hAnsi="Malgun Gothic"/>
+                <w:color w:val="212121"/>
+                <w:sz w:val="20"/>
+              </w:rPr>
+              <w:t>상단 로고 아래 가로 펼침형 대메뉴 및 호버 시 유리 질감 드롭다운 서브메뉴</w:t>
+            </w:r>
+          </w:p>
+        </w:tc>
+        <w:tc>
+          <w:tcPr>
+            <w:tcW w:type="dxa" w:w="2340"/>
+            <w:tcMar>
+              <w:top w:w="120" w:type="dxa"/>
+              <w:bottom w:w="120" w:type="dxa"/>
+              <w:left w:w="180" w:type="dxa"/>
+              <w:right w:w="180" w:type="dxa"/>
+            </w:tcMar>
+            <w:shd w:fill="F9FBF9"/>
+            <w:tcBorders>
+              <w:top w:sz="2" w:val="single" w:color="CCCCCC"/>
+              <w:bottom w:sz="2" w:val="single" w:color="CCCCCC"/>
+              <w:left w:sz="2" w:val="single" w:color="CCCCCC"/>
+              <w:right w:sz="2" w:val="single" w:color="CCCCCC"/>
+            </w:tcBorders>
+          </w:tcPr>
+          <w:p>
+            <w:pPr>
+              <w:spacing w:after="40" w:line="276" w:lineRule="auto"/>
+            </w:pPr>
+            <w:r>
+              <w:rPr>
+                <w:rFonts w:ascii="Malgun Gothic" w:hAnsi="Malgun Gothic"/>
+                <w:color w:val="212121"/>
+                <w:sz w:val="20"/>
+              </w:rPr>
+              <w:t>대메뉴 및 서브메뉴 링크 작동 정상 여부 검수</w:t>
+            </w:r>
+          </w:p>
+        </w:tc>
+      </w:tr>
+      <w:tr>
+        <w:tc>
+          <w:tcPr>
+            <w:tcW w:type="dxa" w:w="2340"/>
+            <w:tcMar>
+              <w:top w:w="120" w:type="dxa"/>
+              <w:bottom w:w="120" w:type="dxa"/>
+              <w:left w:w="180" w:type="dxa"/>
+              <w:right w:w="180" w:type="dxa"/>
+            </w:tcMar>
+            <w:shd w:fill="FFFFFF"/>
+            <w:tcBorders>
+              <w:top w:sz="2" w:val="single" w:color="CCCCCC"/>
+              <w:bottom w:sz="2" w:val="single" w:color="CCCCCC"/>
+              <w:left w:sz="2" w:val="single" w:color="CCCCCC"/>
+              <w:right w:sz="2" w:val="single" w:color="CCCCCC"/>
+            </w:tcBorders>
+          </w:tcPr>
+          <w:p>
+            <w:pPr>
+              <w:spacing w:after="40" w:line="276" w:lineRule="auto"/>
+            </w:pPr>
+          </w:p>
+        </w:tc>
+        <w:tc>
+          <w:tcPr>
+            <w:tcW w:type="dxa" w:w="2340"/>
+            <w:tcMar>
+              <w:top w:w="120" w:type="dxa"/>
+              <w:bottom w:w="120" w:type="dxa"/>
+              <w:left w:w="180" w:type="dxa"/>
+              <w:right w:w="180" w:type="dxa"/>
+            </w:tcMar>
+            <w:shd w:fill="FFFFFF"/>
+            <w:tcBorders>
+              <w:top w:sz="2" w:val="single" w:color="CCCCCC"/>
+              <w:bottom w:sz="2" w:val="single" w:color="CCCCCC"/>
+              <w:left w:sz="2" w:val="single" w:color="CCCCCC"/>
+              <w:right w:sz="2" w:val="single" w:color="CCCCCC"/>
+            </w:tcBorders>
+          </w:tcPr>
+          <w:p>
+            <w:pPr>
+              <w:spacing w:after="40" w:line="276" w:lineRule="auto"/>
+            </w:pPr>
+            <w:r>
+              <w:rPr>
+                <w:rFonts w:ascii="Malgun Gothic" w:hAnsi="Malgun Gothic"/>
+                <w:b/>
+                <w:color w:val="212121"/>
+                <w:sz w:val="20"/>
+              </w:rPr>
+              <w:t>모바일 햄버거 메뉴</w:t>
+            </w:r>
+          </w:p>
+        </w:tc>
+        <w:tc>
+          <w:tcPr>
+            <w:tcW w:type="dxa" w:w="2340"/>
+            <w:tcMar>
+              <w:top w:w="120" w:type="dxa"/>
+              <w:bottom w:w="120" w:type="dxa"/>
+              <w:left w:w="180" w:type="dxa"/>
+              <w:right w:w="180" w:type="dxa"/>
+            </w:tcMar>
+            <w:shd w:fill="FFFFFF"/>
+            <w:tcBorders>
+              <w:top w:sz="2" w:val="single" w:color="CCCCCC"/>
+              <w:bottom w:sz="2" w:val="single" w:color="CCCCCC"/>
+              <w:left w:sz="2" w:val="single" w:color="CCCCCC"/>
+              <w:right w:sz="2" w:val="single" w:color="CCCCCC"/>
+            </w:tcBorders>
+          </w:tcPr>
+          <w:p>
+            <w:pPr>
+              <w:spacing w:after="40" w:line="276" w:lineRule="auto"/>
+            </w:pPr>
+            <w:r>
+              <w:rPr>
+                <w:rFonts w:ascii="Malgun Gothic" w:hAnsi="Malgun Gothic"/>
+                <w:color w:val="212121"/>
+                <w:sz w:val="20"/>
+              </w:rPr>
+              <w:t>모바일 및 태블릿 전용 오버레이 전체화면 메뉴 (lerp 휠/드래그 보정)</w:t>
+            </w:r>
+          </w:p>
+        </w:tc>
+        <w:tc>
+          <w:tcPr>
+            <w:tcW w:type="dxa" w:w="2340"/>
+            <w:tcMar>
+              <w:top w:w="120" w:type="dxa"/>
+              <w:bottom w:w="120" w:type="dxa"/>
+              <w:left w:w="180" w:type="dxa"/>
+              <w:right w:w="180" w:type="dxa"/>
+            </w:tcMar>
+            <w:shd w:fill="FFFFFF"/>
+            <w:tcBorders>
+              <w:top w:sz="2" w:val="single" w:color="CCCCCC"/>
+              <w:bottom w:sz="2" w:val="single" w:color="CCCCCC"/>
+              <w:left w:sz="2" w:val="single" w:color="CCCCCC"/>
+              <w:right w:sz="2" w:val="single" w:color="CCCCCC"/>
+            </w:tcBorders>
+          </w:tcPr>
+          <w:p>
+            <w:pPr>
+              <w:spacing w:after="40" w:line="276" w:lineRule="auto"/>
+            </w:pPr>
+            <w:r>
+              <w:rPr>
+                <w:rFonts w:ascii="Malgun Gothic" w:hAnsi="Malgun Gothic"/>
+                <w:color w:val="212121"/>
+                <w:sz w:val="20"/>
+              </w:rPr>
+              <w:t>햄버거 토글 버튼 작동 및 오버레이 메뉴 내 하위 메뉴 정상 작동 여부 검수</w:t>
+            </w:r>
+          </w:p>
+        </w:tc>
+      </w:tr>
+      <w:tr>
+        <w:tc>
+          <w:tcPr>
+            <w:tcW w:type="dxa" w:w="2340"/>
+            <w:tcMar>
+              <w:top w:w="120" w:type="dxa"/>
+              <w:bottom w:w="120" w:type="dxa"/>
+              <w:left w:w="180" w:type="dxa"/>
+              <w:right w:w="180" w:type="dxa"/>
+            </w:tcMar>
+            <w:shd w:fill="F9FBF9"/>
+            <w:tcBorders>
+              <w:top w:sz="2" w:val="single" w:color="CCCCCC"/>
+              <w:bottom w:sz="2" w:val="single" w:color="CCCCCC"/>
+              <w:left w:sz="2" w:val="single" w:color="CCCCCC"/>
+              <w:right w:sz="2" w:val="single" w:color="CCCCCC"/>
+            </w:tcBorders>
+          </w:tcPr>
+          <w:p>
+            <w:pPr>
+              <w:spacing w:after="40" w:line="276" w:lineRule="auto"/>
+            </w:pPr>
+          </w:p>
+        </w:tc>
+        <w:tc>
+          <w:tcPr>
+            <w:tcW w:type="dxa" w:w="2340"/>
+            <w:tcMar>
+              <w:top w:w="120" w:type="dxa"/>
+              <w:bottom w:w="120" w:type="dxa"/>
+              <w:left w:w="180" w:type="dxa"/>
+              <w:right w:w="180" w:type="dxa"/>
+            </w:tcMar>
+            <w:shd w:fill="F9FBF9"/>
+            <w:tcBorders>
+              <w:top w:sz="2" w:val="single" w:color="CCCCCC"/>
+              <w:bottom w:sz="2" w:val="single" w:color="CCCCCC"/>
+              <w:left w:sz="2" w:val="single" w:color="CCCCCC"/>
+              <w:right w:sz="2" w:val="single" w:color="CCCCCC"/>
+            </w:tcBorders>
+          </w:tcPr>
+          <w:p>
+            <w:pPr>
+              <w:spacing w:after="40" w:line="276" w:lineRule="auto"/>
+            </w:pPr>
+            <w:r>
+              <w:rPr>
+                <w:rFonts w:ascii="Malgun Gothic" w:hAnsi="Malgun Gothic"/>
+                <w:b/>
+                <w:color w:val="212121"/>
+                <w:sz w:val="20"/>
+              </w:rPr>
               <w:t>공통 푸터 (Footer)</w:t>
             </w:r>
           </w:p>

</xml_diff>